<commit_message>
feat(usp71): update OOS-262074 report and tables to align with OOS-261987 gold standard
</commit_message>
<xml_diff>
--- a/scratch/OOS-262074 Hillstone Pharmacy (E17047) - USP71.docx
+++ b/scratch/OOS-262074 Hillstone Pharmacy (E17047) - USP71.docx
@@ -10732,11 +10732,7 @@
                 <w:szCs w:val="22"/>
                 <w:lang w:eastAsia="zh-CN"/>
               </w:rPr>
-              <w:t xml:space="preserve">The cleanroom used for processing procedures (Suite 115) comprises three interconnected sections: the innermost ISO 7 cleanroom (115B), which connects to the middle ISO 7 buffer room (115A), and then to the outermost ISO 8 anteroom (115). A positive air pressure system is maintained throughout the suite to ensure controlled, unidirectional airflow from 115B through 115A and into 115.</w:t>
-              <w:br/>
-              <w:t xml:space="preserve"/>
-              <w:br/>
-              <w:t xml:space="preserve">The ISO 5 BSC E001314, located in the innermost ISO 7 room (115B), was used for sample processing steps. It was thoroughly cleaned and disinfected prior to each procedure in accordance with SOP 2.600.018 (Cleaning and Disinfecting Procedure for Microbiology). Additionally, BSC E001314 was certified and approved by both the Engineering and Quality Assurance teams. Sample processing was conducted in the ISO 5 BSC E001314 in 115B by Alex Saravia on 31Aug26 as per SOP 2.600.008 (USP 71&gt; / EP 2.6.1 Sterility Test).</w:t>
+              <w:t xml:space="preserve">The ISO 5 BSC E001314, located in the innermost ISO 7 room, (115B), was used for sample processing steps. It was thoroughly cleaned and disinfected prior to each procedure in accordance with MICRO SOP-9 (Cleaning and Disinfecting Procedure for Microbiology). Additionally, BSC E001314 was certified and approved by both the Engineering and Quality Assurance teams. Sample processing was conducted in the ISO 5 BSC E001314 in the innermost ISO 7 room, (115B) by Alex Saravia on 31 Aug 2026 as per MICRO-SOP-5 (USP 71&gt; / EP 2.6.1 Sterility Test).</w:t>
             </w:r>
           </w:p>
           <w:p>
@@ -10916,7 +10912,7 @@
                 <w:szCs w:val="22"/>
                 <w:lang w:eastAsia="zh-CN"/>
               </w:rPr>
-              <w:t xml:space="preserve">A review of the Environmental Monitoring (EM) results for the relevant testing period showed no microbial growth on daily personnel monitoring plates (left and right glove touches), daily settling plates, or ISO 5 BSC E001314 surface sampling plates across all bracketing dates (28Aug26, 31Aug26, and 01Sep26). Weekly cleanroom surface sampling for Cleanroom 115 (E001737), performed on 04Sep26, likewise demonstrated no microbial growth. Weekly active air sampling on 04Sep26 showed 1 CFU (ETX-260914-0487, pending identification) in the ISO 8 anteroom (114). However, all sample processing activities were performed within the validated ISO 5 BSC E001314 located in innermost ISO 7 cleanroom 115B. The sample containers were transferred inside closed, disinfected bins, and did not come into contact with ambient ISO 8 air. Furthermore, the complete absence of microbial recovery across all daily analyst glove touch plates, critical ISO 5 BSC work surfaces, and settling plates confirms that no contamination transfer pathway existed between the lower-classified anteroom environment and the ISO 5 processing zone. </w:t>
+              <w:t xml:space="preserve">Upon analyzing the environmental monitoring results, no microbial growth was detected on personnel monitoring plates, settling plates, or ISO 5 BSC surface sampling plates on the date of testing (31 Aug 2026), the preceding testing date (28 Aug 2026), or the subsequent testing date (01 Sep 2026). Additionally, no microbial growth was recovered from the weekly surface sampling plate collected on 04 Sep 2026 for Cleanroom 115 (E001737). However, weekly active air monitoring of ISO 8 Room 114 (CR 114) recovered 1 CFU (ETX-260914-0487, pending identification). </w:t>
             </w:r>
           </w:p>
           <w:p>
@@ -11063,7 +11059,7 @@
                 <w:szCs w:val="22"/>
                 <w:lang w:eastAsia="zh-CN"/>
               </w:rPr>
-              <w:t xml:space="preserve">To assess the potential for sample-to-sample contamination contributing to the positive results, a comprehensive review was conducted of all samples processed on the same day. To assess the potential for sample-to-sample contamination contributing to the positive results, a comprehensive review was conducted of all samples processed on the same day (31Aug26). Sample ETX-260806-0702 was the 4th sample processed in the batch. All other samples processed by the analyst in the batch on that day tested negative. These findings confirm that cross-contamination between samples is highly unlikely.</w:t>
+              <w:t xml:space="preserve">To assess the potential for sample-to-sample contamination contributing to the positive results, a comprehensive review was conducted of all samples processed on the same day. To assess the potential for sample-to-sample contamination contributing to the positive results, a comprehensive review was conducted of all samples processed on the same day (31 Aug 2026). Sample ETX-260806-0702 was the 4th sample processed in the batch. All other samples processed by the analyst and other analysts that day tested negative. These findings suggest that cross-contamination between samples is highly unlikely.</w:t>
             </w:r>
           </w:p>
           <w:p>
@@ -12136,7 +12132,7 @@
                 <w:i w:val="0"/>
                 <w:sz w:val="15"/>
               </w:rPr>
-              <w:t>Reading Analyst</w:t>
+              <w:t>Processing Analyst</w:t>
             </w:r>
           </w:p>
         </w:tc>
@@ -12158,7 +12154,7 @@
                 <w:i w:val="0"/>
                 <w:sz w:val="15"/>
               </w:rPr>
-              <w:t>Day of Incubation</w:t>
+              <w:t>Reading Analyst</w:t>
             </w:r>
           </w:p>
         </w:tc>
@@ -12224,7 +12220,7 @@
                 <w:i w:val="0"/>
                 <w:sz w:val="15"/>
               </w:rPr>
-              <w:t>Media with microbial growth</w:t>
+              <w:t>Media with Microbial growth</w:t>
             </w:r>
           </w:p>
         </w:tc>
@@ -12246,7 +12242,7 @@
                 <w:i w:val="0"/>
                 <w:sz w:val="15"/>
               </w:rPr>
-              <w:t>Microbial Identification</w:t>
+              <w:t>Morphology Description</w:t>
             </w:r>
           </w:p>
         </w:tc>
@@ -12273,7 +12269,7 @@
                 <w:i w:val="0"/>
                 <w:sz w:val="15"/>
               </w:rPr>
-              <w:t>Andrew Carrillo</w:t>
+              <w:t>Alex Saravia</w:t>
             </w:r>
           </w:p>
         </w:tc>
@@ -12295,7 +12291,7 @@
                 <w:i w:val="0"/>
                 <w:sz w:val="15"/>
               </w:rPr>
-              <w:t>7</w:t>
+              <w:t>Andrew Carrillo</w:t>
             </w:r>
           </w:p>
         </w:tc>
@@ -12393,7 +12389,7 @@
               </w:rPr>
               <w:t>Paenibacillus lautus</w:t>
               <w:br/>
-              <w:t>Gram (+) rods</w:t>
+              <w:t>(Gram (+) rods)</w:t>
             </w:r>
           </w:p>
         </w:tc>
@@ -14571,7 +14567,7 @@
                 <w:i w:val="0"/>
                 <w:sz w:val="15"/>
               </w:rPr>
-              <w:t>Weekly Active Air Sampling for CR 114</w:t>
+              <w:t>Weekly Active Air Sampling of CR 115 (E001737)</w:t>
             </w:r>
           </w:p>
         </w:tc>
@@ -14708,7 +14704,9 @@
                 <w:i w:val="0"/>
                 <w:sz w:val="14"/>
               </w:rPr>
-              <w:t>1 CFU (ISO8)</w:t>
+              <w:t>1 CFU</w:t>
+              <w:br/>
+              <w:t>(ISO 8 114)</w:t>
             </w:r>
           </w:p>
         </w:tc>
@@ -14802,7 +14800,7 @@
                 <w:i w:val="0"/>
                 <w:sz w:val="15"/>
               </w:rPr>
-              <w:t>Surface Sampling of Anteroom and Cleanroom for CR 115 (E001737)</w:t>
+              <w:t>Surface Sampling of Anteroom and Cleanroom of CR 115 (E001737)</w:t>
             </w:r>
           </w:p>
         </w:tc>

</xml_diff>

<commit_message>
fix(usp71): update cleanroom suite to CR 114 and BSC to E001316 for OOS-262074
</commit_message>
<xml_diff>
--- a/scratch/OOS-262074 Hillstone Pharmacy (E17047) - USP71.docx
+++ b/scratch/OOS-262074 Hillstone Pharmacy (E17047) - USP71.docx
@@ -7320,7 +7320,7 @@
                 <w:szCs w:val="22"/>
                 <w:lang w:eastAsia="zh-CN"/>
               </w:rPr>
-              <w:t xml:space="preserve">1314</w:t>
+              <w:t xml:space="preserve">1316</w:t>
             </w:r>
           </w:p>
         </w:tc>
@@ -7606,7 +7606,7 @@
               </w:rPr>
             </w:pPr>
             <w:r>
-              <w:t xml:space="preserve">E001737 (CR115)</w:t>
+              <w:t xml:space="preserve">E001736 (CR114)</w:t>
             </w:r>
           </w:p>
           <w:p>
@@ -10459,11 +10459,11 @@
               <w:br/>
               <w:t xml:space="preserve"/>
               <w:br/>
-              <w:t xml:space="preserve">The cleanroom suite (CR 115) used for processing procedures comprises three interconnected sections: the innermost ISO 7 cleanroom (115B), which connects to the middle ISO 7 buffer room (115A), and then to the outermost ISO 8 anteroom (115). A positive air pressure system is maintained throughout the suite to ensure controlled, unidirectional airflow from 115B through 115A and into 115.</w:t>
+              <w:t xml:space="preserve">The cleanroom suite (CR 114) used for processing procedures comprises three interconnected sections: the innermost ISO 7 cleanroom (114B), which connects to the middle ISO 7 buffer room (114A), and then to the outermost ISO 8 anteroom (114). A positive air pressure system is maintained throughout the suite to ensure controlled, unidirectional airflow from 114B through 114A and into 114.</w:t>
               <w:br/>
               <w:t xml:space="preserve"/>
               <w:br/>
-              <w:t xml:space="preserve">The ISO 5 BSC E001314, located in the innermost ISO 7 room, (115B), was used for sample processing steps. It was thoroughly cleaned and disinfected prior to each procedure in accordance with MICRO SOP-9 (Cleaning and Disinfecting Procedure for Microbiology). Additionally, BSC E001314 was certified and approved by both the Engineering and Quality Assurance teams. Sample processing was conducted in the ISO 5 BSC E001314 in the innermost ISO 7 room, (115B) by Alex Saravia on 31 Aug 2026 as per MICRO-SOP-5 (USP 71&gt; / EP 2.6.1 Sterility Test).</w:t>
+              <w:t xml:space="preserve">The ISO 5 BSC E001316, located in the innermost ISO 7 room, (114B), was used for sample processing steps. It was thoroughly cleaned and disinfected prior to each procedure in accordance with MICRO SOP-9 (Cleaning and Disinfecting Procedure for Microbiology). Additionally, BSC E001316 was certified and approved by both the Engineering and Quality Assurance teams. Sample processing was conducted in the ISO 5 BSC E001316 in the innermost ISO 7 room, (114B) by Alex Saravia on 31 Aug 2026 as per MICRO-SOP-5 (USP 71&gt; / EP 2.6.1 Sterility Test).</w:t>
               <w:br/>
               <w:t xml:space="preserve"/>
               <w:br/>
@@ -10471,7 +10471,7 @@
               <w:br/>
               <w:t xml:space="preserve"/>
               <w:br/>
-              <w:t xml:space="preserve">The secondary disinfection happened in the ISO 8 anteroom (115), where the vials were again treated with acidified bleach and provided a 10-minute contact time before processing. Subsequently, the vials were moved into innermost ISO 7 cleanroom (115B). Inside this cleanroom, the processing analyst, Alex Saravia, performed a final disinfection step, allowing an additional 10-minute contact time. Once fully disinfected, the vials were transferred into the ISO 5 BSC E001314.</w:t>
+              <w:t xml:space="preserve">The secondary disinfection happened in the ISO 8 anteroom (114), where the vials were again treated with acidified bleach and provided a 10-minute contact time before processing. Subsequently, the vials were moved into innermost ISO 7 cleanroom (114B). Inside this cleanroom, the processing analyst, Alex Saravia, performed a final disinfection step, allowing an additional 10-minute contact time. Once fully disinfected, the vials were transferred into the ISO 5 BSC E001316.</w:t>
               <w:br/>
               <w:t xml:space="preserve"/>
               <w:br/>
@@ -10487,15 +10487,15 @@
               <w:br/>
               <w:t xml:space="preserve"/>
               <w:br/>
-              <w:t xml:space="preserve">Upon analyzing the environmental monitoring results, no microbial growth was detected on personnel monitoring plates, settling plates, or ISO 5 BSC surface sampling plates on the date of testing (31 Aug 2026), the preceding testing date (28 Aug 2026), or the subsequent testing date (01 Sep 2026). Additionally, no microbial growth was recovered from the weekly surface sampling plate collected on 04 Sep 2026 for Cleanroom 115 (E001737). However, weekly active air monitoring of ISO 8 Room 114 (CR 114) recovered 1 CFU (ETX-260914-0487, pending identification).</w:t>
+              <w:t xml:space="preserve">Upon analyzing the environmental monitoring results, no microbial growth was detected on personnel monitoring plates, settling plates, or ISO 5 BSC surface sampling plates on the date of testing (31 Aug 2026), the preceding testing date (28 Aug 2026), or the subsequent testing date (01 Sep 2026). Additionally, no microbial growth was recovered from the weekly surface sampling plate collected on 04 Sep 2026 for Cleanroom 114 (E001736). However, weekly active air monitoring of ISO 8 Room 114 (CR 114) recovered 1 CFU (ETX-260914-0487, pending identification).</w:t>
               <w:br/>
               <w:t xml:space="preserve"/>
               <w:br/>
-              <w:t xml:space="preserve">It is important to note that all sample processing activities were performed within the validated ISO 5 BSC E001314 located in the innermost ISO 7 cleanroom (Suite 115B). The test samples do not come into contact with ambient ISO 8 air, as samples are transferred in disinfected, lidded containers through the layered cleanroom suites. Furthermore, the colony recovery occurred in the lower-classified ISO 8 anteroom environment, which is physically segregated from the ISO 5 processing zone.</w:t>
+              <w:t xml:space="preserve">It is important to note that all sample processing activities were performed within the validated ISO 5 BSC E001316 located in the innermost ISO 7 cleanroom (Suite 114B). The test samples do not come into contact with ambient ISO 8 air, as samples are transferred in disinfected, lidded containers through the layered cleanroom suites. Furthermore, the colony recovery occurred in the lower-classified ISO 8 anteroom environment, which is physically segregated from the ISO 5 processing zone.</w:t>
               <w:br/>
               <w:t xml:space="preserve"/>
               <w:br/>
-              <w:t xml:space="preserve">In addition, considering the facility's layered disinfection program, controlled unidirectional airflow, and cleanroom design, it is unlikely that the microbial contaminant detected in the ISO 8 environment impacted on the sample processed within the ISO 5 area of the ISO 7 cleanroom (Suite 115B).</w:t>
+              <w:t xml:space="preserve">In addition, considering the facility's layered disinfection program, controlled unidirectional airflow, and cleanroom design, it is unlikely that the microbial contaminant detected in the ISO 8 environment impacted on the sample processed within the ISO 5 area of the ISO 7 cleanroom (Suite 114B).</w:t>
               <w:br/>
               <w:t xml:space="preserve"/>
               <w:br/>
@@ -10511,7 +10511,7 @@
               <w:br/>
               <w:t xml:space="preserve"/>
               <w:br/>
-              <w:t xml:space="preserve">Monthly cleaning and disinfection of the outermost ISO 8 Anteroom, the middle ISO 7 Buffer room, the innermost ISO 7 cleanroom, and its containing ISO 5 BSCs for Cleanroom suite CR115 was performed on 30 Aug 2026, as per MICRO-SOP-9 (Cleaning and Disinfecting Procedure for Microbiology). During both cleaning cycles, it was documented that all H2O2 indicators passed. This confirms the efficient monthly cleaning of all three parts of Cleanroom suite CR115.</w:t>
+              <w:t xml:space="preserve">Monthly cleaning and disinfection of the outermost ISO 8 Anteroom, the middle ISO 7 Buffer room, the innermost ISO 7 cleanroom, and its containing ISO 5 BSCs for Cleanroom suite CR114 was performed on 30 Aug 2026, as per MICRO-SOP-9 (Cleaning and Disinfecting Procedure for Microbiology). During both cleaning cycles, it was documented that all H2O2 indicators passed. This confirms the efficient monthly cleaning of all three parts of Cleanroom suite CR114.</w:t>
               <w:br/>
               <w:t xml:space="preserve"/>
               <w:br/>
@@ -12745,7 +12745,7 @@
                 <w:i w:val="0"/>
                 <w:sz w:val="15"/>
               </w:rPr>
-              <w:t>Biological Safety Cabinet EM Bracketing Biological Safety Cabinet (BSC) E001314</w:t>
+              <w:t>Biological Safety Cabinet EM Bracketing Biological Safety Cabinet (BSC) E001316</w:t>
             </w:r>
           </w:p>
         </w:tc>
@@ -13991,7 +13991,7 @@
                 <w:i w:val="0"/>
                 <w:sz w:val="15"/>
               </w:rPr>
-              <w:t>Weekly Active Air Sampling of CR 115 (E001737)</w:t>
+              <w:t>Weekly Active Air Sampling of CR 114 (E001736)</w:t>
             </w:r>
           </w:p>
         </w:tc>
@@ -14224,7 +14224,7 @@
                 <w:i w:val="0"/>
                 <w:sz w:val="15"/>
               </w:rPr>
-              <w:t>Surface Sampling of Anteroom and Cleanroom of CR 115 (E001737)</w:t>
+              <w:t>Surface Sampling of Anteroom and Cleanroom of CR 114 (E001736)</w:t>
             </w:r>
           </w:p>
         </w:tc>

</xml_diff>

<commit_message>
feat(usp71): align OOS-262074 with QYC final signed layout, initials, and 2-page narrative format
</commit_message>
<xml_diff>
--- a/scratch/OOS-262074 Hillstone Pharmacy (E17047) - USP71.docx
+++ b/scratch/OOS-262074 Hillstone Pharmacy (E17047) - USP71.docx
@@ -10447,83 +10447,29 @@
           <w:p/>
           <w:p>
             <w:r>
-              <w:t xml:space="preserve">All analysts involved in the prepping, processing, and reading of the sample – Andrew Carrillo, Alex Saravia and Andrew Carrillo, were interviewed comprehensively. Their answers are recorded throughout this document.</w:t>
+              <w:t xml:space="preserve">All analysts involved in the prepping, processing, and reading of the sample – Andrew Carrillo, Alex Saravia and Andrew Carrillo, were interviewed comprehensively. Their answers are recorded throughout this document.
+Upon arrival, the sample was stored in accordance with the Client’s instructions. Analysts - Andrew Carrillo and Alex Saravia - verified the integrity of the sample throughout both the preparation and processing stages. No leaks or turbidity were observed at any point, verifying the integrity of the sample.
+All reagents and supplies mentioned in the material section above were stored according to the suppliers’ recommendations, and their integrity was visually verified before utilization. Moreover, all reagents and supplies had valid expiration dates. The functionality of all equipment was confirmed by reviewing data generated by our comprehensive in-house continuous monitoring system.
+The cleanroom suite (CR 114) used for processing procedures comprises three interconnected sections: the innermost ISO 7 cleanroom (114B), which connects to the middle ISO 7 buffer room (114A), and then to the outermost ISO 8 anteroom (114). A positive air pressure system is maintained throughout the suite to ensure controlled, unidirectional airflow from 114B through 114A and into 114.
+The ISO 5 BSC E001316, located in the innermost ISO 7 room, (114B), was used for sample processing steps. It was thoroughly cleaned and disinfected prior to each procedure in accordance with MICRO SOP-9 (Cleaning and Disinfecting Procedure for Microbiology). Additionally, BSC E001316 was certified and approved by both the Engineering and Quality Assurance teams. Sample processing was conducted in the ISO 5 BSC E001316 in the innermost ISO 7 room, (114B) by Alex Saravia on 31 Aug 2026 as per MICRO-SOP-5 (USP 71&gt; / EP 2.6.1 Sterility Test).
+On 28 Aug 2026, the sample vials for ETX-260806-0702 were received from the Sample Submissions team and brought into the Sterile Microbiology lab. Upon arrival, each sample vial was sprayed with an acidified bleach disinfectant, placed into pre-disinfected bins, and allowed a 10-minute contact time.
+The secondary disinfection happened in the ISO 8 anteroom (114), where the vials were again treated with acidified bleach and provided a 10-minute contact time before processing. Subsequently, the vials were moved into innermost ISO 7 cleanroom (114B). Inside this cleanroom, the processing analyst, Alex Saravia, performed a final disinfection step, allowing an additional 10-minute contact time. Once fully disinfected, the vials were transferred into the ISO 5 BSC E001316.
+Inside the BSC, each container was aseptically opened, ensuring minimal exposure to the environment. The contents of 10 vials (20 mL per media) were dispensed directly from the container into sterile canisters placed on a vacuum manifold for membrane filtration under method suitability ETX-260623-0160. The sample was processed and tested as per MICRO-SOP-5 (USP 71&gt; / EP 2.6.1 Sterility Test). Media bottles were transferred into incubators E001356 and E001357 to begin incubation.
+On 07 Sep 2026 (Day 7 of incubation), microbial growth was observed in one TSB (Tryptic Soy Broth) media bottle by reading analyst, Andrew Carrillo, and confirmed by Microbiology Lab Supervisor, Robin Seymour. The positive TSB bottle for ETX-260806-0702 was submitted for Differential Staining and Microbial Identification under ETX-260907-0017.  Definitive identification identified the isolate as Paenibacillus lautus Gram (+) rods.
+The culture media utilized were within their expiry period. Negative control media bottles for the membrane filtration method were handled, processed, and incubated in the same manner as the test samples. No microbial growth was observed in the corresponding negative controls.
+Upon analyzing the environmental monitoring results, no microbial growth was detected on personnel monitoring plates, settling plates, or ISO 5 BSC surface sampling plates on the date of testing (31 Aug 2026), the preceding testing date (28 Aug 2026), or the subsequent testing date (01 Sep 2026). Additionally, no microbial growth was recovered from the weekly surface sampling plate collected on 04 Sep 2026 for Cleanroom 114 (E001736). However, weekly active air monitoring of ISO 8 Room 114 (CR 114) recovered 1 CFU (ETX-260914-0487, pending identification).</w:t>
               <w:br/>
               <w:t xml:space="preserve"/>
               <w:br/>
-              <w:t xml:space="preserve">Upon arrival, the sample was stored in accordance with the Client’s instructions. Analysts - Andrew Carrillo and Alex Saravia - verified the integrity of the sample throughout both the preparation and processing stages. No leaks or turbidity were observed at any point, verifying the integrity of the sample.</w:t>
-              <w:br/>
-              <w:t xml:space="preserve"/>
-              <w:br/>
-              <w:t xml:space="preserve">All reagents and supplies mentioned in the material section above were stored according to the suppliers’ recommendations, and their integrity was visually verified before utilization. Moreover, all reagents and supplies had valid expiration dates. The functionality of all equipment was confirmed by reviewing data generated by our comprehensive in-house continuous monitoring system.</w:t>
-              <w:br/>
-              <w:t xml:space="preserve"/>
-              <w:br/>
-              <w:t xml:space="preserve">The cleanroom suite (CR 114) used for processing procedures comprises three interconnected sections: the innermost ISO 7 cleanroom (114B), which connects to the middle ISO 7 buffer room (114A), and then to the outermost ISO 8 anteroom (114). A positive air pressure system is maintained throughout the suite to ensure controlled, unidirectional airflow from 114B through 114A and into 114.</w:t>
-              <w:br/>
-              <w:t xml:space="preserve"/>
-              <w:br/>
-              <w:t xml:space="preserve">The ISO 5 BSC E001316, located in the innermost ISO 7 room, (114B), was used for sample processing steps. It was thoroughly cleaned and disinfected prior to each procedure in accordance with MICRO SOP-9 (Cleaning and Disinfecting Procedure for Microbiology). Additionally, BSC E001316 was certified and approved by both the Engineering and Quality Assurance teams. Sample processing was conducted in the ISO 5 BSC E001316 in the innermost ISO 7 room, (114B) by Alex Saravia on 31 Aug 2026 as per MICRO-SOP-5 (USP 71&gt; / EP 2.6.1 Sterility Test).</w:t>
-              <w:br/>
-              <w:t xml:space="preserve"/>
-              <w:br/>
-              <w:t xml:space="preserve">On 28 Aug 2026, the sample vials for ETX-260806-0702 were received from the Sample Submissions team and brought into the Sterile Microbiology lab. Upon arrival, each sample vial was sprayed with an acidified bleach disinfectant, placed into pre-disinfected bins, and allowed a 10-minute contact time.</w:t>
-              <w:br/>
-              <w:t xml:space="preserve"/>
-              <w:br/>
-              <w:t xml:space="preserve">The secondary disinfection happened in the ISO 8 anteroom (114), where the vials were again treated with acidified bleach and provided a 10-minute contact time before processing. Subsequently, the vials were moved into innermost ISO 7 cleanroom (114B). Inside this cleanroom, the processing analyst, Alex Saravia, performed a final disinfection step, allowing an additional 10-minute contact time. Once fully disinfected, the vials were transferred into the ISO 5 BSC E001316.</w:t>
-              <w:br/>
-              <w:t xml:space="preserve"/>
-              <w:br/>
-              <w:t xml:space="preserve">Inside the BSC, each container was aseptically opened, ensuring minimal exposure to the environment. The contents of 10 vials (20 mL per media) were dispensed directly from the container into sterile canisters placed on a vacuum manifold for membrane filtration under method suitability ETX-260623-0160. The sample was processed and tested as per MICRO-SOP-5 (USP 71&gt; / EP 2.6.1 Sterility Test). Media bottles were transferred into incubators E001356 and E001357 to begin incubation.</w:t>
-              <w:br/>
-              <w:t xml:space="preserve"/>
-              <w:br/>
-              <w:t xml:space="preserve">On 07 Sep 2026 (Day 7 of incubation), microbial growth was observed in one TSB (Tryptic Soy Broth) media bottle by reading analyst, Andrew Carrillo, and confirmed by Microbiology Lab Supervisor, Robin Seymour. The positive TSB bottle for ETX-260806-0702 was submitted for Differential Staining and Microbial Identification under ETX-260907-0017. Differential staining indicated the presence of Gram-positive rods. Definitive identification identified the isolate as Paenibacillus lautus Gram (+) rods.</w:t>
-              <w:br/>
-              <w:t xml:space="preserve"/>
-              <w:br/>
-              <w:t xml:space="preserve">The culture media utilized were within their expiry period. Negative control media bottles for the membrane filtration method were handled, processed, and incubated in the same manner as the test samples. No microbial growth was observed in the corresponding negative controls.</w:t>
-              <w:br/>
-              <w:t xml:space="preserve"/>
-              <w:br/>
-              <w:t xml:space="preserve">Upon analyzing the environmental monitoring results, no microbial growth was detected on personnel monitoring plates, settling plates, or ISO 5 BSC surface sampling plates on the date of testing (31 Aug 2026), the preceding testing date (28 Aug 2026), or the subsequent testing date (01 Sep 2026). Additionally, no microbial growth was recovered from the weekly surface sampling plate collected on 04 Sep 2026 for Cleanroom 114 (E001736). However, weekly active air monitoring of ISO 8 Room 114 (CR 114) recovered 1 CFU (ETX-260914-0487, pending identification).</w:t>
-              <w:br/>
-              <w:t xml:space="preserve"/>
-              <w:br/>
-              <w:t xml:space="preserve">It is important to note that all sample processing activities were performed within the validated ISO 5 BSC E001316 located in the innermost ISO 7 cleanroom (Suite 114B). The test samples do not come into contact with ambient ISO 8 air, as samples are transferred in disinfected, lidded containers through the layered cleanroom suites. Furthermore, the colony recovery occurred in the lower-classified ISO 8 anteroom environment, which is physically segregated from the ISO 5 processing zone.</w:t>
-              <w:br/>
-              <w:t xml:space="preserve"/>
-              <w:br/>
-              <w:t xml:space="preserve">In addition, considering the facility's layered disinfection program, controlled unidirectional airflow, and cleanroom design, it is unlikely that the microbial contaminant detected in the ISO 8 environment impacted on the sample processed within the ISO 5 area of the ISO 7 cleanroom (Suite 114B).</w:t>
-              <w:br/>
-              <w:t xml:space="preserve"/>
-              <w:br/>
-              <w:t xml:space="preserve">The absence of contamination on analyst glove plates and work-surface environmental monitoring plates collected on the date of testing indicates that there was no viable transfer of contaminants to the ISO 5 biological safety cabinet (BSC). Additionally, the lack of contamination in other samples processed during the same testing session further demonstrates that the testing environment was operating in optimal condition.</w:t>
-              <w:br/>
-              <w:t xml:space="preserve"/>
-              <w:br/>
-              <w:t xml:space="preserve">Therefore, considering that no viable organisms were recovered from the ISO 5 environment, personnel monitoring results were acceptable on the date of testing, and the environmental isolates were not recovered from locations or surfaces directly involved in sample preparation or testing, the environmental isolate is not considered a credible source of the contamination detected in the test sample.</w:t>
-              <w:br/>
-              <w:t xml:space="preserve"/>
-              <w:br/>
-              <w:t xml:space="preserve">The analysts confirmed full compliance with cleaning procedures as outlined in MICRO SOP-9 (Cleaning and Disinfecting Procedure for Microbiology) and MICRO-SOP-5 (USP 71&gt; / EP 2.6.1 Sterility Test).</w:t>
-              <w:br/>
-              <w:t xml:space="preserve"/>
-              <w:br/>
-              <w:t xml:space="preserve">Monthly cleaning and disinfection of the outermost ISO 8 Anteroom, the middle ISO 7 Buffer room, the innermost ISO 7 cleanroom, and its containing ISO 5 BSCs for Cleanroom suite CR114 was performed on 30 Aug 2026, as per MICRO-SOP-9 (Cleaning and Disinfecting Procedure for Microbiology). During both cleaning cycles, it was documented that all H2O2 indicators passed. This confirms the efficient monthly cleaning of all three parts of Cleanroom suite CR114.</w:t>
-              <w:br/>
-              <w:t xml:space="preserve"/>
-              <w:br/>
-              <w:t xml:space="preserve">Analyzing a 6-month sample history for Hillstone Pharmacy (E17047), this specific analyte "TB-500 10mg/ml" has had no prior failures using USP 71&gt; / EP 2.6.1 Sterility Test during this period. Crucially, this sample was submitted as part of a Beyond-Use Date (BUD) stability study for lot 24JUL2026-059. The baseline T0 time point (tested on 06 Aug 2026 by analyst G. Li) yielded valid passing results for USP 71&gt; sterility, along with passing USP 1207&gt; Container Closure Integrity and USP 85&gt; Bacterial Endotoxin testing. Furthermore, at the current T30 time point, all other concurrent testing—including Appearance, pH, Potency (TB-500  Benzyl Alcohol), USP 788&gt; Particulate Matter, and USP 85&gt; Bacterial Endotoxin—met all acceptance criteria and passed. The isolation of microbial growth (Paenibacillus lautus) exclusively at the 30-day stability storage interval indicates a true product stability/Beyond-Use Date limitation rather than laboratory contamination during sample manipulation on 31 Aug 2026.</w:t>
-              <w:br/>
-              <w:t xml:space="preserve"/>
-              <w:br/>
-              <w:t xml:space="preserve">To assess the potential for sample-to-sample contamination contributing to the positive results, a comprehensive review was conducted of all samples processed on the same day (31 Aug 2026). Sample ETX-260806-0702 was the 4th sample processed in the batch. All other samples processed by the analyst and other analysts that day tested negative. These findings suggest that cross-contamination between samples is highly unlikely.</w:t>
-              <w:br/>
-              <w:t xml:space="preserve"/>
-              <w:br/>
-              <w:t xml:space="preserve">Based on the observations outlined above, it is unlikely that the failing results were due to reagents, supplies, the cleanroom environment, the process, or analyst involvement. Consequently, the possibility of laboratory error contributing to this failure is minimal and the original result is deemed to be valid.</w:t>
+              <w:t xml:space="preserve">It is important to note that all sample processing activities were performed within the validated ISO 5 BSC E001316 located in the innermost ISO 7 cleanroom (Suite 114B). The test samples do not come into contact with ambient ISO 8 air, as samples are transferred in disinfected, lidded containers through the layered cleanroom suites. Furthermore, the colony recovery occurred in the lower-classified ISO 8 anteroom environment, which is physically segregated from the ISO 5 processing zone.
+In addition, considering the facility's layered disinfection program, controlled unidirectional airflow, and cleanroom design, it is unlikely that the microbial contaminant detected in the ISO 8 environment impacted on the sample processed within the ISO 5 area of the ISO 7 cleanroom (Suite 114B).
+The absence of contamination on analyst glove plates and work-surface environmental monitoring plates collected on the date of testing indicates that there was no viable transfer of contaminants to the ISO 5 biological safety cabinet (BSC). Additionally, the lack of contamination in other samples processed during the same testing session further demonstrates that the testing environment was operating in optimal condition.
+Therefore, considering that no viable organisms were recovered from the ISO 5 environment, personnel monitoring results were acceptable on the date of testing, and the environmental isolates were not recovered from locations or surfaces directly involved in sample preparation or testing, the environmental isolate is not considered a credible source of the contamination detected in the test sample.
+The analysts confirmed full compliance with cleaning procedures as outlined in MICRO SOP-9 (Cleaning and Disinfecting Procedure for Microbiology) and MICRO-SOP-5 (USP 71&gt; / EP 2.6.1 Sterility Test).
+Monthly cleaning and disinfection of the outermost ISO 8 Anteroom, the middle ISO 7 Buffer room, the innermost ISO 7 cleanroom, and its containing ISO 5 BSCs for Cleanroom suite CR114 was performed on 30 Aug 2026, as per MICRO-SOP-9 (Cleaning and Disinfecting Procedure for Microbiology). During both cleaning cycles, it was documented that all H2O2 indicators passed. This confirms the efficient monthly cleaning of all three parts of Cleanroom suite CR114.
+Analyzing a 6-month sample history for Hillstone Pharmacy (E17047), this specific analyte "TB-500 10mg/ml" has had no prior failures using USP 71&gt; / EP 2.6.1 Sterility Test during this period. This sample was submitted as part of a Beyond-Use Date (BUD) stability study for lot 24JUL2026-059. The baseline T0 time point (tested on 06 Aug 2026 by analyst GL) yielded valid passing results for USP 71&gt; sterility.
+To assess the potential for sample-to-sample contamination contributing to the positive results, a comprehensive review was conducted of all samples processed on the same day (31 Aug 2026). Sample ETX-260806-0702 was the 4th sample processed in the batch. All other samples processed by the analyst and other analysts that day tested negative. These findings suggest that cross-contamination between samples is highly unlikely.
+Based on the observations outlined above, it is unlikely that the failing results were due to reagents, supplies, the cleanroom environment, the process, or analyst involvement. Consequently, the possibility of laboratory error contributing to this failure is minimal and the original result is deemed to be valid.</w:t>
             </w:r>
           </w:p>
           <w:p/>

</xml_diff>

<commit_message>
feat(usp71): incorporate QA review edits from RS (E001736, 2 CFUs EM update, BUD-T30 ID, YES checkboxes)
</commit_message>
<xml_diff>
--- a/scratch/OOS-262074 Hillstone Pharmacy (E17047) - USP71.docx
+++ b/scratch/OOS-262074 Hillstone Pharmacy (E17047) - USP71.docx
@@ -10452,23 +10452,23 @@
 All reagents and supplies mentioned in the material section above were stored according to the suppliers’ recommendations, and their integrity was visually verified before utilization. Moreover, all reagents and supplies had valid expiration dates. The functionality of all equipment was confirmed by reviewing data generated by our comprehensive in-house continuous monitoring system.
 The cleanroom suite (CR 114) used for processing procedures comprises three interconnected sections: the innermost ISO 7 cleanroom (114B), which connects to the middle ISO 7 buffer room (114A), and then to the outermost ISO 8 anteroom (114). A positive air pressure system is maintained throughout the suite to ensure controlled, unidirectional airflow from 114B through 114A and into 114.
 The ISO 5 BSC E001316, located in the innermost ISO 7 room, (114B), was used for sample processing steps. It was thoroughly cleaned and disinfected prior to each procedure in accordance with MICRO SOP-9 (Cleaning and Disinfecting Procedure for Microbiology). Additionally, BSC E001316 was certified and approved by both the Engineering and Quality Assurance teams. Sample processing was conducted in the ISO 5 BSC E001316 in the innermost ISO 7 room, (114B) by Alex Saravia on 31 Aug 2026 as per MICRO-SOP-5 (USP 71&gt; / EP 2.6.1 Sterility Test).
-On 28 Aug 2026, the sample vials for ETX-260806-0702 were received from the Sample Submissions team and brought into the Sterile Microbiology lab. Upon arrival, each sample vial was sprayed with an acidified bleach disinfectant, placed into pre-disinfected bins, and allowed a 10-minute contact time.
+On 28 Aug 2026, the sample vials for ETX-260806-0702-T30 were received from the Sample Submissions team and brought into the Sterile Microbiology lab. Upon arrival, each sample vial was sprayed with an acidified bleach disinfectant, placed into pre-disinfected bins, and allowed a 10-minute contact time.
 The secondary disinfection happened in the ISO 8 anteroom (114), where the vials were again treated with acidified bleach and provided a 10-minute contact time before processing. Subsequently, the vials were moved into innermost ISO 7 cleanroom (114B). Inside this cleanroom, the processing analyst, Alex Saravia, performed a final disinfection step, allowing an additional 10-minute contact time. Once fully disinfected, the vials were transferred into the ISO 5 BSC E001316.
-Inside the BSC, each container was aseptically opened, ensuring minimal exposure to the environment. The contents of 10 vials (20 mL per media) were dispensed directly from the container into sterile canisters placed on a vacuum manifold for membrane filtration under method suitability ETX-260623-0160. The sample was processed and tested as per MICRO-SOP-5 (USP 71&gt; / EP 2.6.1 Sterility Test). Media bottles were transferred into incubators E001356 and E001357 to begin incubation.
-On 07 Sep 2026 (Day 7 of incubation), microbial growth was observed in one TSB (Tryptic Soy Broth) media bottle by reading analyst, Andrew Carrillo, and confirmed by Microbiology Lab Supervisor, Robin Seymour. The positive TSB bottle for ETX-260806-0702 was submitted for Differential Staining and Microbial Identification under ETX-260907-0017.  Definitive identification identified the isolate as Paenibacillus lautus Gram (+) rods.
-The culture media utilized were within their expiry period. Negative control media bottles for the membrane filtration method were handled, processed, and incubated in the same manner as the test samples. No microbial growth was observed in the corresponding negative controls.
-Upon analyzing the environmental monitoring results, no microbial growth was detected on personnel monitoring plates, settling plates, or ISO 5 BSC surface sampling plates on the date of testing (31 Aug 2026), the preceding testing date (28 Aug 2026), or the subsequent testing date (01 Sep 2026). Additionally, no microbial growth was recovered from the weekly surface sampling plate collected on 04 Sep 2026 for Cleanroom 114 (E001736). However, weekly active air monitoring of ISO 8 Room 114 (CR 114) recovered 1 CFU (ETX-260914-0487, pending identification).</w:t>
+Inside the BSC, each container was aseptically opened, ensuring minimal exposure to the environment. The contents of 10 vials (20 mL per media type) were dispensed directly from the container into sterile canisters placed on a vacuum manifold for membrane filtration under method suitability ETX-260623-0160. The sample was processed and tested as per MICRO-SOP-5 (USP 71&gt; / EP 2.6.1 Sterility Test). Media bottles were transferred into incubators E001356 and E001357 to begin incubation.
+On 07 Sep 2026 (Day 7 of incubation), microbial growth was observed in one TSB (Tryptic Soy Broth) media bottle by reading analyst, Andrew Carrillo, and confirmed by Microbiology Lab Supervisor, Robin Seymour. The positive TSB bottle for ETX-260806-0702-T30 was submitted for Differential Staining and Microbial Identification under ETX-260907-0017.  Definitive identification identified the isolate as Paenibacillus lautus, Gram (+) rods.</w:t>
               <w:br/>
               <w:t xml:space="preserve"/>
               <w:br/>
-              <w:t xml:space="preserve">It is important to note that all sample processing activities were performed within the validated ISO 5 BSC E001316 located in the innermost ISO 7 cleanroom (Suite 114B). The test samples do not come into contact with ambient ISO 8 air, as samples are transferred in disinfected, lidded containers through the layered cleanroom suites. Furthermore, the colony recovery occurred in the lower-classified ISO 8 anteroom environment, which is physically segregated from the ISO 5 processing zone.
-In addition, considering the facility's layered disinfection program, controlled unidirectional airflow, and cleanroom design, it is unlikely that the microbial contaminant detected in the ISO 8 environment impacted on the sample processed within the ISO 5 area of the ISO 7 cleanroom (Suite 114B).
+              <w:t xml:space="preserve">ISO 5 BSC Environmental Monitoring Results Evaluation:
+After reviewing the Environmental Monitoring (EM) results for the relevant testing period, no microbial growth was detected on personnel monitoring plates, settling plates, or ISO 5 BSC surface sampling plates on the date of testing, the preceding sampling date, or the subsequent sampling date.
+Cleanroom Environmental Monitoring Results Evaluation:
+No microbial growth was recovered from the weekly active surface sampling plate collected on 04 Sep 2026. However, 2 CFUs (ETX-260914-0487) were recovered from the weekly active air sampling of ISO 8 cleanroom 114. The organism was identified to be of Gram-positive coccobacilli and Gram-positive rod morphology. It is important to note that all sample processing activities were performed within the validated ISO 5 BSC E001316 located in the innermost ISO 7 cleanroom (114B). The test samples do not come into contact with ambient ISO 8 air, as samples are transferred in disinfected, lidded containers through the layered cleanroom suites. Furthermore, the colony recovery occurred in the lower-classified ISO 8 anteroom environment, which is physically segregated from the ISO 5 processing zone. In addition, considering the facility's layered disinfection program, controlled unidirectional airflow, and cleanroom design, it is unlikely that the microbial contaminant detected in the ISO 8 environment impacted on the sample processed within the ISO 5 area of the ISO 7 cleanroom (114B).
 The absence of contamination on analyst glove plates and work-surface environmental monitoring plates collected on the date of testing indicates that there was no viable transfer of contaminants to the ISO 5 biological safety cabinet (BSC). Additionally, the lack of contamination in other samples processed during the same testing session further demonstrates that the testing environment was operating in optimal condition.
 Therefore, considering that no viable organisms were recovered from the ISO 5 environment, personnel monitoring results were acceptable on the date of testing, and the environmental isolates were not recovered from locations or surfaces directly involved in sample preparation or testing, the environmental isolate is not considered a credible source of the contamination detected in the test sample.
 The analysts confirmed full compliance with cleaning procedures as outlined in MICRO SOP-9 (Cleaning and Disinfecting Procedure for Microbiology) and MICRO-SOP-5 (USP 71&gt; / EP 2.6.1 Sterility Test).
 Monthly cleaning and disinfection of the outermost ISO 8 Anteroom, the middle ISO 7 Buffer room, the innermost ISO 7 cleanroom, and its containing ISO 5 BSCs for Cleanroom suite CR114 was performed on 30 Aug 2026, as per MICRO-SOP-9 (Cleaning and Disinfecting Procedure for Microbiology). During both cleaning cycles, it was documented that all H2O2 indicators passed. This confirms the efficient monthly cleaning of all three parts of Cleanroom suite CR114.
 Analyzing a 6-month sample history for Hillstone Pharmacy (E17047), this specific analyte "TB-500 10mg/ml" has had no prior failures using USP 71&gt; / EP 2.6.1 Sterility Test during this period. This sample was submitted as part of a Beyond-Use Date (BUD) stability study for lot 24JUL2026-059. The baseline T0 time point (tested on 06 Aug 2026 by analyst GL) yielded valid passing results for USP 71&gt; sterility.
-To assess the potential for sample-to-sample contamination contributing to the positive results, a comprehensive review was conducted of all samples processed on the same day (31 Aug 2026). Sample ETX-260806-0702 was the 4th sample processed in the batch. All other samples processed by the analyst and other analysts that day tested negative. These findings suggest that cross-contamination between samples is highly unlikely.
+To assess the potential for sample-to-sample contamination contributing to the positive results, a comprehensive review was conducted of all samples processed on the same day (31 Aug 2026). Sample ETX-260806-0702-T30 was the 4th sample processed in the batch. All other samples processed by the analyst and other analysts that day tested negative. These findings suggest that cross-contamination between samples is highly unlikely.
 Based on the observations outlined above, it is unlikely that the failing results were due to reagents, supplies, the cleanroom environment, the process, or analyst involvement. Consequently, the possibility of laboratory error contributing to this failure is minimal and the original result is deemed to be valid.</w:t>
             </w:r>
           </w:p>
@@ -11686,7 +11686,7 @@
                   <w:szCs w:val="15"/>
                   <w:u w:val="single"/>
                 </w:rPr>
-                <w:t>ETX-260806-0702 (BUD-T30)</w:t>
+                <w:t>ETX-260806-0702-T30</w:t>
               </w:r>
             </w:hyperlink>
           </w:p>
@@ -11846,7 +11846,13 @@
                 <w:i w:val="0"/>
                 <w:sz w:val="14"/>
               </w:rPr>
-              <w:t>Environmental Monitoring (EM) Sampling Site</w:t>
+              <w:t>Environmental</w:t>
+              <w:br/>
+              <w:t>Monitoring</w:t>
+              <w:br/>
+              <w:t>(EM) Sampling</w:t>
+              <w:br/>
+              <w:t>Site</w:t>
             </w:r>
           </w:p>
         </w:tc>
@@ -11892,9 +11898,7 @@
               </w:rPr>
               <w:t>Date</w:t>
               <w:br/>
-              <w:t>(DDMM</w:t>
-              <w:br/>
-              <w:t>YYYY)</w:t>
+              <w:t>(DDMMMYYYY)</w:t>
             </w:r>
           </w:p>
         </w:tc>
@@ -11916,7 +11920,9 @@
                 <w:i w:val="0"/>
                 <w:sz w:val="14"/>
               </w:rPr>
-              <w:t>Analyst (Initials)</w:t>
+              <w:t>Analyst</w:t>
+              <w:br/>
+              <w:t>(Initials)</w:t>
             </w:r>
           </w:p>
         </w:tc>
@@ -11982,7 +11988,11 @@
                 <w:i w:val="0"/>
                 <w:sz w:val="14"/>
               </w:rPr>
-              <w:t>Environmental Monitoring Plate ETX ID</w:t>
+              <w:t>Environmental</w:t>
+              <w:br/>
+              <w:t>Monitoring</w:t>
+              <w:br/>
+              <w:t>Plate ETX ID</w:t>
             </w:r>
           </w:p>
         </w:tc>
@@ -12125,7 +12135,7 @@
                 <w:i w:val="0"/>
                 <w:sz w:val="14"/>
               </w:rPr>
-              <w:t>28 Aug 2026</w:t>
+              <w:t>28Aug2026</w:t>
             </w:r>
           </w:p>
         </w:tc>
@@ -12328,7 +12338,7 @@
                 <w:i w:val="0"/>
                 <w:sz w:val="14"/>
               </w:rPr>
-              <w:t>31 Aug 2026</w:t>
+              <w:t>31Aug2026</w:t>
             </w:r>
           </w:p>
         </w:tc>
@@ -12531,7 +12541,7 @@
                 <w:i w:val="0"/>
                 <w:sz w:val="14"/>
               </w:rPr>
-              <w:t>01 Sep 2026</w:t>
+              <w:t>01Sep2026</w:t>
             </w:r>
           </w:p>
         </w:tc>
@@ -12762,7 +12772,7 @@
                 <w:i w:val="0"/>
                 <w:sz w:val="14"/>
               </w:rPr>
-              <w:t>28 Aug 2026</w:t>
+              <w:t>28Aug2026</w:t>
             </w:r>
           </w:p>
         </w:tc>
@@ -12965,7 +12975,7 @@
                 <w:i w:val="0"/>
                 <w:sz w:val="14"/>
               </w:rPr>
-              <w:t>31 Aug 2026</w:t>
+              <w:t>31Aug2026</w:t>
             </w:r>
           </w:p>
         </w:tc>
@@ -13168,7 +13178,7 @@
                 <w:i w:val="0"/>
                 <w:sz w:val="14"/>
               </w:rPr>
-              <w:t>01 Sep 2026</w:t>
+              <w:t>01Sep2026</w:t>
             </w:r>
           </w:p>
         </w:tc>
@@ -13371,7 +13381,7 @@
                 <w:i w:val="0"/>
                 <w:sz w:val="14"/>
               </w:rPr>
-              <w:t>28 Aug 2026</w:t>
+              <w:t>28Aug2026</w:t>
             </w:r>
           </w:p>
         </w:tc>
@@ -13574,7 +13584,7 @@
                 <w:i w:val="0"/>
                 <w:sz w:val="14"/>
               </w:rPr>
-              <w:t>31 Aug 2026</w:t>
+              <w:t>31Aug2026</w:t>
             </w:r>
           </w:p>
         </w:tc>
@@ -13777,7 +13787,7 @@
                 <w:i w:val="0"/>
                 <w:sz w:val="14"/>
               </w:rPr>
-              <w:t>01 Sep 2026</w:t>
+              <w:t>01Sep2026</w:t>
             </w:r>
           </w:p>
         </w:tc>
@@ -14008,7 +14018,7 @@
                 <w:i w:val="0"/>
                 <w:sz w:val="14"/>
               </w:rPr>
-              <w:t>04 Sep 2026</w:t>
+              <w:t>04Sep2026</w:t>
             </w:r>
           </w:p>
         </w:tc>
@@ -14074,7 +14084,7 @@
                 <w:i w:val="0"/>
                 <w:sz w:val="14"/>
               </w:rPr>
-              <w:t>1 CFU</w:t>
+              <w:t>2 CFUs</w:t>
               <w:br/>
               <w:t>(ISO 8 114)</w:t>
             </w:r>
@@ -14120,7 +14130,9 @@
                 <w:i w:val="0"/>
                 <w:sz w:val="14"/>
               </w:rPr>
-              <w:t>Pending</w:t>
+              <w:t>Gram (+) rods and</w:t>
+              <w:br/>
+              <w:t>Gram (+) coccobacilli</w:t>
             </w:r>
           </w:p>
         </w:tc>
@@ -14241,7 +14253,7 @@
                 <w:i w:val="0"/>
                 <w:sz w:val="14"/>
               </w:rPr>
-              <w:t>04 Sep 2026</w:t>
+              <w:t>04Sep2026</w:t>
             </w:r>
           </w:p>
         </w:tc>

</xml_diff>